<commit_message>
Cycle 2: corrective experiments Z1-Z6, manuscript v3 integrating cohort-variance account and strict remedies
Co-Authored-By: Claude Sonnet 5.5 <noreply@anthropic.com>
Claude-Session: https://claude.ai/code/session_01QHzkZ7jvqQ7qpsTaxao7k1
</commit_message>
<xml_diff>
--- a/reinforced/manuscript/Revised_Cover_Letter.docx
+++ b/reinforced/manuscript/Revised_Cover_Letter.docx
@@ -21,7 +21,7 @@
     <w:p/>
     <w:p>
       <w:r>
-        <w:t>We submit “How well do a journal's recent acceptance times predict the next paper's? An out-of-time evaluation across 800 journals” as a Research article.</w:t>
+        <w:t>We submit “How well do a journal's recent acceptance times predict the next paper's? An out-of-time evaluation of 781 journals from three publishers” as a Research article.</w:t>
       </w:r>
     </w:p>
     <w:p/>
@@ -33,7 +33,7 @@
     <w:p/>
     <w:p>
       <w:r>
-        <w:t>Evidence. Using publisher-deposited dates for 1,737,272 articles in 800 journals, we scored forecasts built only from information visible at the time against 298,469 later submissions. Journal history reduces forecast loss by 16% relative to publisher-pooled forecasts, but intervals are wide and over-confident by two to three coverage points; the shortfall persists in cohort-to-cohort comparisons but vanishes under random splitting and in a stationary simulation; a recalibration learned on earlier cohorts removes most of the average bias; and only 1.6% of journal-origins accepted at least 80% of papers within 72 days. We tested the validity of the received date against preprint posting dates for Springer Nature journals and could not do so for the others. Most pre-specified hypotheses were not supported and we report this.</w:t>
+        <w:t>Evidence. Using publisher-deposited dates for 1,737,272 articles in 800 journals, we scored forecasts built only from information visible at the time against 298,469 later submissions. Journal history reduces forecast loss by 16% relative to publisher-pooled forecasts, but intervals are wide and over-confident by two to three coverage points; the shortfall vanishes under random splitting and in a stationary simulation but is of the order produced by random cohort-to-cohort shifts of the size of the estimated journal × year variance; simple recalibration learned strictly from earlier cohorts over-corrects; and only 1.6% of journal-origins accepted at least 80% of papers within 72 days. We tested the validity of the received date against preprint posting dates for Springer Nature journals and could not do so for the others. Most pre-specified hypotheses were not supported or were inconclusive and we report this. The work was done and reviewed entirely by AI instances without human review, which we disclose.</w:t>
       </w:r>
     </w:p>
     <w:p/>

</xml_diff>